<commit_message>
Separated tutor guide and developer guide.
</commit_message>
<xml_diff>
--- a/docs/AssortmentBox.docx
+++ b/docs/AssortmentBox.docx
@@ -1,6 +1,6 @@
 
 <file path=word/document.xml><?xml version="1.0" encoding="utf-8"?>
-<w:document xmlns:wpc="http://schemas.microsoft.com/office/word/2010/wordprocessingCanvas" xmlns:cx="http://schemas.microsoft.com/office/drawing/2014/chartex" xmlns:cx1="http://schemas.microsoft.com/office/drawing/2015/9/8/chartex" xmlns:cx2="http://schemas.microsoft.com/office/drawing/2015/10/21/chartex" xmlns:cx3="http://schemas.microsoft.com/office/drawing/2016/5/9/chartex" xmlns:cx4="http://schemas.microsoft.com/office/drawing/2016/5/10/chartex" xmlns:cx5="http://schemas.microsoft.com/office/drawing/2016/5/11/chartex" xmlns:cx6="http://schemas.microsoft.com/office/drawing/2016/5/12/chartex" xmlns:cx7="http://schemas.microsoft.com/office/drawing/2016/5/13/chartex" xmlns:cx8="http://schemas.microsoft.com/office/drawing/2016/5/14/chartex" xmlns:mc="http://schemas.openxmlformats.org/markup-compatibility/2006" xmlns:aink="http://schemas.microsoft.com/office/drawing/2016/ink" xmlns:am3d="http://schemas.microsoft.com/office/drawing/2017/model3d" xmlns:o="urn:schemas-microsoft-com:office:office" xmlns:oel="http://schemas.microsoft.com/office/2019/extlst" xmlns:r="http://schemas.openxmlformats.org/officeDocument/2006/relationships" xmlns:m="http://schemas.openxmlformats.org/officeDocument/2006/math" xmlns:v="urn:schemas-microsoft-com:vml" xmlns:wp14="http://schemas.microsoft.com/office/word/2010/wordprocessingDrawing" xmlns:wp="http://schemas.openxmlformats.org/drawingml/2006/wordprocessingDrawing" xmlns:w10="urn:schemas-microsoft-com:office:word" xmlns:w="http://schemas.openxmlformats.org/wordprocessingml/2006/main" xmlns:w14="http://schemas.microsoft.com/office/word/2010/wordml" xmlns:w15="http://schemas.microsoft.com/office/word/2012/wordml" xmlns:w16cei="http://schemas.microsoft.com/office/word/2026/wordml/cei" xmlns:w16cex="http://schemas.microsoft.com/office/word/2018/wordml/cex" xmlns:w16cid="http://schemas.microsoft.com/office/word/2016/wordml/cid" xmlns:w16="http://schemas.microsoft.com/office/word/2018/wordml" xmlns:w16du="http://schemas.microsoft.com/office/word/2023/wordml/word16du" xmlns:w16sdtdh="http://schemas.microsoft.com/office/word/2020/wordml/sdtdatahash" xmlns:w16sdtfl="http://schemas.microsoft.com/office/word/2024/wordml/sdtformatlock" xmlns:w16se="http://schemas.microsoft.com/office/word/2015/wordml/symex" xmlns:wpg="http://schemas.microsoft.com/office/word/2010/wordprocessingGroup" xmlns:wpi="http://schemas.microsoft.com/office/word/2010/wordprocessingInk" xmlns:wne="http://schemas.microsoft.com/office/word/2006/wordml" xmlns:wps="http://schemas.microsoft.com/office/word/2010/wordprocessingShape" mc:Ignorable="w14 w15 w16se w16cid w16 w16cex w16sdtdh w16sdtfl w16du wp14">
+<w:document xmlns:wpc="http://schemas.microsoft.com/office/word/2010/wordprocessingCanvas" xmlns:cx="http://schemas.microsoft.com/office/drawing/2014/chartex" xmlns:cx1="http://schemas.microsoft.com/office/drawing/2015/9/8/chartex" xmlns:cx2="http://schemas.microsoft.com/office/drawing/2015/10/21/chartex" xmlns:cx3="http://schemas.microsoft.com/office/drawing/2016/5/9/chartex" xmlns:cx4="http://schemas.microsoft.com/office/drawing/2016/5/10/chartex" xmlns:cx5="http://schemas.microsoft.com/office/drawing/2016/5/11/chartex" xmlns:cx6="http://schemas.microsoft.com/office/drawing/2016/5/12/chartex" xmlns:cx7="http://schemas.microsoft.com/office/drawing/2016/5/13/chartex" xmlns:cx8="http://schemas.microsoft.com/office/drawing/2016/5/14/chartex" xmlns:mc="http://schemas.openxmlformats.org/markup-compatibility/2006" xmlns:aink="http://schemas.microsoft.com/office/drawing/2016/ink" xmlns:am3d="http://schemas.microsoft.com/office/drawing/2017/model3d" xmlns:o="urn:schemas-microsoft-com:office:office" xmlns:oel="http://schemas.microsoft.com/office/2019/extlst" xmlns:r="http://schemas.openxmlformats.org/officeDocument/2006/relationships" xmlns:m="http://schemas.openxmlformats.org/officeDocument/2006/math" xmlns:v="urn:schemas-microsoft-com:vml" xmlns:wp14="http://schemas.microsoft.com/office/word/2010/wordprocessingDrawing" xmlns:wp="http://schemas.openxmlformats.org/drawingml/2006/wordprocessingDrawing" xmlns:w10="urn:schemas-microsoft-com:office:word" xmlns:w="http://schemas.openxmlformats.org/wordprocessingml/2006/main" xmlns:w14="http://schemas.microsoft.com/office/word/2010/wordml" xmlns:w15="http://schemas.microsoft.com/office/word/2012/wordml" xmlns:w16cex="http://schemas.microsoft.com/office/word/2018/wordml/cex" xmlns:w16cid="http://schemas.microsoft.com/office/word/2016/wordml/cid" xmlns:w16="http://schemas.microsoft.com/office/word/2018/wordml" xmlns:w16du="http://schemas.microsoft.com/office/word/2023/wordml/word16du" xmlns:w16sdtdh="http://schemas.microsoft.com/office/word/2020/wordml/sdtdatahash" xmlns:w16sdtfl="http://schemas.microsoft.com/office/word/2024/wordml/sdtformatlock" xmlns:w16se="http://schemas.microsoft.com/office/word/2015/wordml/symex" xmlns:wpg="http://schemas.microsoft.com/office/word/2010/wordprocessingGroup" xmlns:wpi="http://schemas.microsoft.com/office/word/2010/wordprocessingInk" xmlns:wne="http://schemas.microsoft.com/office/word/2006/wordml" xmlns:wps="http://schemas.microsoft.com/office/word/2010/wordprocessingShape" mc:Ignorable="w14 w15 w16se w16cid w16 w16cex w16sdtdh w16sdtfl w16du wp14">
   <w:body>
     <w:tbl>
       <w:tblPr>
@@ -1652,8 +1652,20 @@
                 <w:szCs w:val="20"/>
                 <w:lang w:val="en-US"/>
               </w:rPr>
-              <w:t>Programmer USBasp</w:t>
-            </w:r>
+              <w:t xml:space="preserve">Programmer </w:t>
+            </w:r>
+            <w:proofErr w:type="spellStart"/>
+            <w:r>
+              <w:rPr>
+                <w:b/>
+                <w:bCs/>
+                <w:sz w:val="20"/>
+                <w:szCs w:val="20"/>
+                <w:lang w:val="en-US"/>
+              </w:rPr>
+              <w:t>USBasp</w:t>
+            </w:r>
+            <w:proofErr w:type="spellEnd"/>
           </w:p>
         </w:tc>
         <w:tc>
@@ -2281,7 +2293,23 @@
                 <w:sz w:val="20"/>
                 <w:szCs w:val="20"/>
               </w:rPr>
-              <w:t>MOUNT AFTER PROGRAMMING!</w:t>
+              <w:t xml:space="preserve">MOUNT </w:t>
+            </w:r>
+            <w:r>
+              <w:rPr>
+                <w:b/>
+                <w:bCs/>
+                <w:sz w:val="20"/>
+                <w:szCs w:val="20"/>
+              </w:rPr>
+              <w:t>AFTER</w:t>
+            </w:r>
+            <w:r>
+              <w:rPr>
+                <w:sz w:val="20"/>
+                <w:szCs w:val="20"/>
+              </w:rPr>
+              <w:t xml:space="preserve"> PROGRAMMING!</w:t>
             </w:r>
           </w:p>
         </w:tc>
@@ -2314,7 +2342,7 @@
                 <w:szCs w:val="20"/>
               </w:rPr>
               <w:drawing>
-                <wp:inline distT="0" distB="0" distL="0" distR="0" wp14:anchorId="4DF8F818" wp14:editId="16672913">
+                <wp:inline distT="0" distB="0" distL="0" distR="0" wp14:anchorId="4DF8F818" wp14:editId="30A98D12">
                   <wp:extent cx="872746" cy="479342"/>
                   <wp:effectExtent l="0" t="0" r="3810" b="0"/>
                   <wp:docPr id="1839167822" name="Grafik 1"/>
@@ -2375,6 +2403,7 @@
               <w:rPr>
                 <w:b/>
                 <w:bCs/>
+                <w:noProof/>
                 <w:sz w:val="20"/>
                 <w:szCs w:val="20"/>
               </w:rPr>
@@ -2426,22 +2455,20 @@
           <w:lang w:val="en-US"/>
         </w:rPr>
       </w:pPr>
-    </w:p>
-    <w:p>
-      <w:pPr>
-        <w:rPr>
-          <w:lang w:val="en-US"/>
-        </w:rPr>
-      </w:pPr>
       <w:r>
-        <w:rPr>
-          <w:noProof/>
-        </w:rPr>
         <w:drawing>
-          <wp:inline distT="0" distB="0" distL="0" distR="0" wp14:anchorId="305F9E2D" wp14:editId="00FE6237">
-            <wp:extent cx="3934725" cy="2306354"/>
-            <wp:effectExtent l="19050" t="19050" r="27940" b="17780"/>
-            <wp:docPr id="1862866562" name="Grafik 1" descr="Ein Bild, das Text, Screenshot, Schrift, Schraube enthält.&#10;&#10;KI-generierte Inhalte können fehlerhaft sein."/>
+          <wp:anchor distT="0" distB="0" distL="114300" distR="114300" simplePos="0" relativeHeight="251661312" behindDoc="0" locked="0" layoutInCell="1" allowOverlap="1" wp14:anchorId="6890042B" wp14:editId="6D859DC2">
+            <wp:simplePos x="0" y="0"/>
+            <wp:positionH relativeFrom="column">
+              <wp:posOffset>4100195</wp:posOffset>
+            </wp:positionH>
+            <wp:positionV relativeFrom="paragraph">
+              <wp:posOffset>78105</wp:posOffset>
+            </wp:positionV>
+            <wp:extent cx="2352675" cy="2346325"/>
+            <wp:effectExtent l="0" t="0" r="0" b="0"/>
+            <wp:wrapSquare wrapText="bothSides"/>
+            <wp:docPr id="1364200198" name="Grafik 2"/>
             <wp:cNvGraphicFramePr>
               <a:graphicFrameLocks xmlns:a="http://schemas.openxmlformats.org/drawingml/2006/main" noChangeAspect="1"/>
             </wp:cNvGraphicFramePr>
@@ -2449,7 +2476,7 @@
               <a:graphicData uri="http://schemas.openxmlformats.org/drawingml/2006/picture">
                 <pic:pic xmlns:pic="http://schemas.openxmlformats.org/drawingml/2006/picture">
                   <pic:nvPicPr>
-                    <pic:cNvPr id="1862866562" name="Grafik 1" descr="Ein Bild, das Text, Screenshot, Schrift, Schraube enthält.&#10;&#10;KI-generierte Inhalte können fehlerhaft sein."/>
+                    <pic:cNvPr id="0" name="Picture 6"/>
                     <pic:cNvPicPr>
                       <a:picLocks noChangeAspect="1" noChangeArrowheads="1"/>
                     </pic:cNvPicPr>
@@ -2470,7 +2497,76 @@
                   <pic:spPr bwMode="auto">
                     <a:xfrm>
                       <a:off x="0" y="0"/>
-                      <a:ext cx="3939435" cy="2309115"/>
+                      <a:ext cx="2352675" cy="2346325"/>
+                    </a:xfrm>
+                    <a:prstGeom prst="rect">
+                      <a:avLst/>
+                    </a:prstGeom>
+                    <a:noFill/>
+                    <a:ln>
+                      <a:noFill/>
+                    </a:ln>
+                  </pic:spPr>
+                </pic:pic>
+              </a:graphicData>
+            </a:graphic>
+            <wp14:sizeRelH relativeFrom="margin">
+              <wp14:pctWidth>0</wp14:pctWidth>
+            </wp14:sizeRelH>
+            <wp14:sizeRelV relativeFrom="margin">
+              <wp14:pctHeight>0</wp14:pctHeight>
+            </wp14:sizeRelV>
+          </wp:anchor>
+        </w:drawing>
+      </w:r>
+    </w:p>
+    <w:p>
+      <w:r>
+        <w:rPr>
+          <w:noProof/>
+        </w:rPr>
+        <w:drawing>
+          <wp:anchor distT="0" distB="0" distL="114300" distR="114300" simplePos="0" relativeHeight="251660288" behindDoc="0" locked="0" layoutInCell="1" allowOverlap="1" wp14:anchorId="305F9E2D" wp14:editId="7A60C57F">
+            <wp:simplePos x="0" y="0"/>
+            <wp:positionH relativeFrom="column">
+              <wp:posOffset>17475</wp:posOffset>
+            </wp:positionH>
+            <wp:positionV relativeFrom="paragraph">
+              <wp:posOffset>20683</wp:posOffset>
+            </wp:positionV>
+            <wp:extent cx="3673627" cy="2153311"/>
+            <wp:effectExtent l="19050" t="19050" r="22225" b="18415"/>
+            <wp:wrapSquare wrapText="bothSides"/>
+            <wp:docPr id="1862866562" name="Grafik 1" descr="Ein Bild, das Text, Screenshot, Schrift, Schraube enthält.&#10;&#10;KI-generierte Inhalte können fehlerhaft sein."/>
+            <wp:cNvGraphicFramePr>
+              <a:graphicFrameLocks xmlns:a="http://schemas.openxmlformats.org/drawingml/2006/main" noChangeAspect="1"/>
+            </wp:cNvGraphicFramePr>
+            <a:graphic xmlns:a="http://schemas.openxmlformats.org/drawingml/2006/main">
+              <a:graphicData uri="http://schemas.openxmlformats.org/drawingml/2006/picture">
+                <pic:pic xmlns:pic="http://schemas.openxmlformats.org/drawingml/2006/picture">
+                  <pic:nvPicPr>
+                    <pic:cNvPr id="1862866562" name="Grafik 1" descr="Ein Bild, das Text, Screenshot, Schrift, Schraube enthält.&#10;&#10;KI-generierte Inhalte können fehlerhaft sein."/>
+                    <pic:cNvPicPr>
+                      <a:picLocks noChangeAspect="1" noChangeArrowheads="1"/>
+                    </pic:cNvPicPr>
+                  </pic:nvPicPr>
+                  <pic:blipFill>
+                    <a:blip r:embed="rId21" cstate="print">
+                      <a:extLst>
+                        <a:ext uri="{28A0092B-C50C-407E-A947-70E740481C1C}">
+                          <a14:useLocalDpi xmlns:a14="http://schemas.microsoft.com/office/drawing/2010/main" val="0"/>
+                        </a:ext>
+                      </a:extLst>
+                    </a:blip>
+                    <a:srcRect/>
+                    <a:stretch>
+                      <a:fillRect/>
+                    </a:stretch>
+                  </pic:blipFill>
+                  <pic:spPr bwMode="auto">
+                    <a:xfrm>
+                      <a:off x="0" y="0"/>
+                      <a:ext cx="3673627" cy="2153311"/>
                     </a:xfrm>
                     <a:prstGeom prst="rect">
                       <a:avLst/>
@@ -2485,7 +2581,7 @@
                 </pic:pic>
               </a:graphicData>
             </a:graphic>
-          </wp:inline>
+          </wp:anchor>
         </w:drawing>
       </w:r>
     </w:p>
@@ -2526,7 +2622,7 @@
                     </pic:cNvPicPr>
                   </pic:nvPicPr>
                   <pic:blipFill>
-                    <a:blip r:embed="rId21">
+                    <a:blip r:embed="rId22">
                       <a:extLst>
                         <a:ext uri="{28A0092B-C50C-407E-A947-70E740481C1C}">
                           <a14:useLocalDpi xmlns:a14="http://schemas.microsoft.com/office/drawing/2010/main" val="0"/>
@@ -2590,7 +2686,7 @@
                     </pic:cNvPicPr>
                   </pic:nvPicPr>
                   <pic:blipFill>
-                    <a:blip r:embed="rId22">
+                    <a:blip r:embed="rId23">
                       <a:extLst>
                         <a:ext uri="{28A0092B-C50C-407E-A947-70E740481C1C}">
                           <a14:useLocalDpi xmlns:a14="http://schemas.microsoft.com/office/drawing/2010/main" val="0"/>
@@ -2663,7 +2759,7 @@
 </file>
 
 <file path=word/numbering.xml><?xml version="1.0" encoding="utf-8"?>
-<w:numbering xmlns:wpc="http://schemas.microsoft.com/office/word/2010/wordprocessingCanvas" xmlns:cx="http://schemas.microsoft.com/office/drawing/2014/chartex" xmlns:cx1="http://schemas.microsoft.com/office/drawing/2015/9/8/chartex" xmlns:cx2="http://schemas.microsoft.com/office/drawing/2015/10/21/chartex" xmlns:cx3="http://schemas.microsoft.com/office/drawing/2016/5/9/chartex" xmlns:cx4="http://schemas.microsoft.com/office/drawing/2016/5/10/chartex" xmlns:cx5="http://schemas.microsoft.com/office/drawing/2016/5/11/chartex" xmlns:cx6="http://schemas.microsoft.com/office/drawing/2016/5/12/chartex" xmlns:cx7="http://schemas.microsoft.com/office/drawing/2016/5/13/chartex" xmlns:cx8="http://schemas.microsoft.com/office/drawing/2016/5/14/chartex" xmlns:mc="http://schemas.openxmlformats.org/markup-compatibility/2006" xmlns:aink="http://schemas.microsoft.com/office/drawing/2016/ink" xmlns:am3d="http://schemas.microsoft.com/office/drawing/2017/model3d" xmlns:o="urn:schemas-microsoft-com:office:office" xmlns:oel="http://schemas.microsoft.com/office/2019/extlst" xmlns:r="http://schemas.openxmlformats.org/officeDocument/2006/relationships" xmlns:m="http://schemas.openxmlformats.org/officeDocument/2006/math" xmlns:v="urn:schemas-microsoft-com:vml" xmlns:wp14="http://schemas.microsoft.com/office/word/2010/wordprocessingDrawing" xmlns:wp="http://schemas.openxmlformats.org/drawingml/2006/wordprocessingDrawing" xmlns:w10="urn:schemas-microsoft-com:office:word" xmlns:w="http://schemas.openxmlformats.org/wordprocessingml/2006/main" xmlns:w14="http://schemas.microsoft.com/office/word/2010/wordml" xmlns:w15="http://schemas.microsoft.com/office/word/2012/wordml" xmlns:w16cei="http://schemas.microsoft.com/office/word/2026/wordml/cei" xmlns:w16cex="http://schemas.microsoft.com/office/word/2018/wordml/cex" xmlns:w16cid="http://schemas.microsoft.com/office/word/2016/wordml/cid" xmlns:w16="http://schemas.microsoft.com/office/word/2018/wordml" xmlns:w16du="http://schemas.microsoft.com/office/word/2023/wordml/word16du" xmlns:w16sdtdh="http://schemas.microsoft.com/office/word/2020/wordml/sdtdatahash" xmlns:w16sdtfl="http://schemas.microsoft.com/office/word/2024/wordml/sdtformatlock" xmlns:w16se="http://schemas.microsoft.com/office/word/2015/wordml/symex" xmlns:wpg="http://schemas.microsoft.com/office/word/2010/wordprocessingGroup" xmlns:wpi="http://schemas.microsoft.com/office/word/2010/wordprocessingInk" xmlns:wne="http://schemas.microsoft.com/office/word/2006/wordml" xmlns:wps="http://schemas.microsoft.com/office/word/2010/wordprocessingShape" mc:Ignorable="w14 w15 w16se w16cid w16 w16cex w16sdtdh w16sdtfl w16du wp14">
+<w:numbering xmlns:wpc="http://schemas.microsoft.com/office/word/2010/wordprocessingCanvas" xmlns:cx="http://schemas.microsoft.com/office/drawing/2014/chartex" xmlns:cx1="http://schemas.microsoft.com/office/drawing/2015/9/8/chartex" xmlns:cx2="http://schemas.microsoft.com/office/drawing/2015/10/21/chartex" xmlns:cx3="http://schemas.microsoft.com/office/drawing/2016/5/9/chartex" xmlns:cx4="http://schemas.microsoft.com/office/drawing/2016/5/10/chartex" xmlns:cx5="http://schemas.microsoft.com/office/drawing/2016/5/11/chartex" xmlns:cx6="http://schemas.microsoft.com/office/drawing/2016/5/12/chartex" xmlns:cx7="http://schemas.microsoft.com/office/drawing/2016/5/13/chartex" xmlns:cx8="http://schemas.microsoft.com/office/drawing/2016/5/14/chartex" xmlns:mc="http://schemas.openxmlformats.org/markup-compatibility/2006" xmlns:aink="http://schemas.microsoft.com/office/drawing/2016/ink" xmlns:am3d="http://schemas.microsoft.com/office/drawing/2017/model3d" xmlns:o="urn:schemas-microsoft-com:office:office" xmlns:oel="http://schemas.microsoft.com/office/2019/extlst" xmlns:r="http://schemas.openxmlformats.org/officeDocument/2006/relationships" xmlns:m="http://schemas.openxmlformats.org/officeDocument/2006/math" xmlns:v="urn:schemas-microsoft-com:vml" xmlns:wp14="http://schemas.microsoft.com/office/word/2010/wordprocessingDrawing" xmlns:wp="http://schemas.openxmlformats.org/drawingml/2006/wordprocessingDrawing" xmlns:w10="urn:schemas-microsoft-com:office:word" xmlns:w="http://schemas.openxmlformats.org/wordprocessingml/2006/main" xmlns:w14="http://schemas.microsoft.com/office/word/2010/wordml" xmlns:w15="http://schemas.microsoft.com/office/word/2012/wordml" xmlns:w16cex="http://schemas.microsoft.com/office/word/2018/wordml/cex" xmlns:w16cid="http://schemas.microsoft.com/office/word/2016/wordml/cid" xmlns:w16="http://schemas.microsoft.com/office/word/2018/wordml" xmlns:w16du="http://schemas.microsoft.com/office/word/2023/wordml/word16du" xmlns:w16sdtdh="http://schemas.microsoft.com/office/word/2020/wordml/sdtdatahash" xmlns:w16sdtfl="http://schemas.microsoft.com/office/word/2024/wordml/sdtformatlock" xmlns:w16se="http://schemas.microsoft.com/office/word/2015/wordml/symex" xmlns:wpg="http://schemas.microsoft.com/office/word/2010/wordprocessingGroup" xmlns:wpi="http://schemas.microsoft.com/office/word/2010/wordprocessingInk" xmlns:wne="http://schemas.microsoft.com/office/word/2006/wordml" xmlns:wps="http://schemas.microsoft.com/office/word/2010/wordprocessingShape" mc:Ignorable="w14 w15 w16se w16cid w16 w16cex w16sdtdh w16sdtfl w16du wp14">
   <w:abstractNum w:abstractNumId="0" w15:restartNumberingAfterBreak="0">
     <w:nsid w:val="43A84932"/>
     <w:multiLevelType w:val="hybridMultilevel"/>
@@ -3479,7 +3575,6 @@
   <w:style w:type="character" w:default="1" w:styleId="Absatz-Standardschriftart">
     <w:name w:val="Default Paragraph Font"/>
     <w:uiPriority w:val="1"/>
-    <w:semiHidden/>
     <w:unhideWhenUsed/>
   </w:style>
   <w:style w:type="table" w:default="1" w:styleId="NormaleTabelle">
@@ -3827,6 +3922,17 @@
       <w:kern w:val="0"/>
     </w:rPr>
   </w:style>
+  <w:style w:type="paragraph" w:styleId="StandardWeb">
+    <w:name w:val="Normal (Web)"/>
+    <w:basedOn w:val="Standard"/>
+    <w:uiPriority w:val="99"/>
+    <w:semiHidden/>
+    <w:unhideWhenUsed/>
+    <w:rsid w:val="005D557D"/>
+    <w:rPr>
+      <w:rFonts w:ascii="Times New Roman" w:hAnsi="Times New Roman" w:cs="Times New Roman"/>
+    </w:rPr>
+  </w:style>
 </w:styles>
 </file>
 

</xml_diff>